<commit_message>
Update Week 3 project documentation with recent changes and clarifications
</commit_message>
<xml_diff>
--- a/docs/Week3_Project_Documentation.docx
+++ b/docs/Week3_Project_Documentation.docx
@@ -34,7 +34,7 @@
         <w:t xml:space="preserve">Date: </w:t>
       </w:r>
       <w:r>
-        <w:t>29 October 2026</w:t>
+        <w:t>30 October 2026</w:t>
       </w:r>
     </w:p>
     <w:p>
@@ -666,6 +666,56 @@
               <w:rPr>
                 <w:sz w:val="20"/>
               </w:rPr>
+              <w:t>Demo PR (demo/payments.py)</w:t>
+            </w:r>
+          </w:p>
+        </w:tc>
+        <w:tc>
+          <w:tcPr>
+            <w:tcW w:type="dxa" w:w="2304"/>
+          </w:tcPr>
+          <w:p>
+            <w:pPr>
+              <w:spacing w:after="40"/>
+            </w:pPr>
+            <w:r>
+              <w:rPr>
+                <w:sz w:val="20"/>
+              </w:rPr>
+              <w:t>My own repo, branch demo/planted-issues</w:t>
+            </w:r>
+          </w:p>
+        </w:tc>
+        <w:tc>
+          <w:tcPr>
+            <w:tcW w:type="dxa" w:w="4896"/>
+          </w:tcPr>
+          <w:p>
+            <w:pPr>
+              <w:spacing w:after="40"/>
+            </w:pPr>
+            <w:r>
+              <w:rPr>
+                <w:sz w:val="20"/>
+              </w:rPr>
+              <w:t>A small file with eight planted problems (hardcoded key, mutable default, verify=False, bare except, eval, shell=True, pickle.loads, divide by zero). Used for the recorded demo and the real posted review.</w:t>
+            </w:r>
+          </w:p>
+        </w:tc>
+      </w:tr>
+      <w:tr>
+        <w:tc>
+          <w:tcPr>
+            <w:tcW w:type="dxa" w:w="2160"/>
+          </w:tcPr>
+          <w:p>
+            <w:pPr>
+              <w:spacing w:after="40"/>
+            </w:pPr>
+            <w:r>
+              <w:rPr>
+                <w:sz w:val="20"/>
+              </w:rPr>
               <w:t>Offline fixtures</w:t>
             </w:r>
           </w:p>
@@ -1051,6 +1101,281 @@
         <w:t>create word document for below — Deliverables for Week 3 …</w:t>
       </w:r>
     </w:p>
+    <w:p>
+      <w:pPr>
+        <w:pStyle w:val="Heading2"/>
+      </w:pPr>
+      <w:r>
+        <w:t>Prompts 7–12: learning the project and preparing the demo</w:t>
+      </w:r>
+    </w:p>
+    <w:tbl>
+      <w:tblPr>
+        <w:tblStyle w:val="TableGrid"/>
+        <w:tblW w:type="auto" w:w="0"/>
+        <w:jc w:val="center"/>
+        <w:tblLook w:firstColumn="1" w:firstRow="1" w:lastColumn="0" w:lastRow="0" w:noHBand="0" w:noVBand="1" w:val="04A0"/>
+      </w:tblPr>
+      <w:tblGrid>
+        <w:gridCol w:w="4680"/>
+        <w:gridCol w:w="4680"/>
+      </w:tblGrid>
+      <w:tr>
+        <w:tc>
+          <w:tcPr>
+            <w:tcW w:type="dxa" w:w="4896"/>
+            <w:shd w:val="clear" w:color="auto" w:fill="1F3A5F"/>
+          </w:tcPr>
+          <w:p>
+            <w:pPr>
+              <w:spacing w:after="40"/>
+            </w:pPr>
+            <w:r>
+              <w:rPr>
+                <w:sz w:val="20"/>
+              </w:rPr>
+            </w:r>
+            <w:r>
+              <w:rPr>
+                <w:b/>
+                <w:color w:val="FFFFFF"/>
+                <w:sz w:val="20"/>
+              </w:rPr>
+              <w:t>Prompt</w:t>
+            </w:r>
+          </w:p>
+        </w:tc>
+        <w:tc>
+          <w:tcPr>
+            <w:tcW w:type="dxa" w:w="4464"/>
+            <w:shd w:val="clear" w:color="auto" w:fill="1F3A5F"/>
+          </w:tcPr>
+          <w:p>
+            <w:pPr>
+              <w:spacing w:after="40"/>
+            </w:pPr>
+            <w:r>
+              <w:rPr>
+                <w:sz w:val="20"/>
+              </w:rPr>
+            </w:r>
+            <w:r>
+              <w:rPr>
+                <w:b/>
+                <w:color w:val="FFFFFF"/>
+                <w:sz w:val="20"/>
+              </w:rPr>
+              <w:t>What it led to</w:t>
+            </w:r>
+          </w:p>
+        </w:tc>
+      </w:tr>
+      <w:tr>
+        <w:tc>
+          <w:tcPr>
+            <w:tcW w:type="dxa" w:w="4896"/>
+          </w:tcPr>
+          <w:p>
+            <w:pPr>
+              <w:spacing w:after="40"/>
+            </w:pPr>
+            <w:r>
+              <w:rPr>
+                <w:sz w:val="20"/>
+              </w:rPr>
+              <w:t>now walk me through step by step so that I have also understanding about the project. explain concept followed by test commands</w:t>
+            </w:r>
+          </w:p>
+        </w:tc>
+        <w:tc>
+          <w:tcPr>
+            <w:tcW w:type="dxa" w:w="4464"/>
+          </w:tcPr>
+          <w:p>
+            <w:pPr>
+              <w:spacing w:after="40"/>
+            </w:pPr>
+            <w:r>
+              <w:rPr>
+                <w:sz w:val="20"/>
+              </w:rPr>
+              <w:t>A step-by-step walkthrough, then a one-page explainer with the LangGraph flow drawn as a diagram.</w:t>
+            </w:r>
+          </w:p>
+        </w:tc>
+      </w:tr>
+      <w:tr>
+        <w:tc>
+          <w:tcPr>
+            <w:tcW w:type="dxa" w:w="4896"/>
+          </w:tcPr>
+          <w:p>
+            <w:pPr>
+              <w:spacing w:after="40"/>
+            </w:pPr>
+            <w:r>
+              <w:rPr>
+                <w:sz w:val="20"/>
+              </w:rPr>
+              <w:t>I need to submit screen recording to showcase project scenarios, walk me through the scenarios with minimal claude credits</w:t>
+            </w:r>
+          </w:p>
+        </w:tc>
+        <w:tc>
+          <w:tcPr>
+            <w:tcW w:type="dxa" w:w="4464"/>
+          </w:tcPr>
+          <w:p>
+            <w:pPr>
+              <w:spacing w:after="40"/>
+            </w:pPr>
+            <w:r>
+              <w:rPr>
+                <w:sz w:val="20"/>
+              </w:rPr>
+              <w:t>A recording script: five free scenarios, two live runs on a small demo PR.</w:t>
+            </w:r>
+          </w:p>
+        </w:tc>
+      </w:tr>
+      <w:tr>
+        <w:tc>
+          <w:tcPr>
+            <w:tcW w:type="dxa" w:w="4896"/>
+          </w:tcPr>
+          <w:p>
+            <w:pPr>
+              <w:spacing w:after="40"/>
+            </w:pPr>
+            <w:r>
+              <w:rPr>
+                <w:sz w:val="20"/>
+              </w:rPr>
+              <w:t>(pasted git error) push declined due to repository rule violations</w:t>
+            </w:r>
+          </w:p>
+        </w:tc>
+        <w:tc>
+          <w:tcPr>
+            <w:tcW w:type="dxa" w:w="4464"/>
+          </w:tcPr>
+          <w:p>
+            <w:pPr>
+              <w:spacing w:after="40"/>
+            </w:pPr>
+            <w:r>
+              <w:rPr>
+                <w:sz w:val="20"/>
+              </w:rPr>
+              <w:t>Found that GitHub secret scanning had blocked the demo's fake API key (iteration 13).</w:t>
+            </w:r>
+          </w:p>
+        </w:tc>
+      </w:tr>
+      <w:tr>
+        <w:tc>
+          <w:tcPr>
+            <w:tcW w:type="dxa" w:w="4896"/>
+          </w:tcPr>
+          <w:p>
+            <w:pPr>
+              <w:spacing w:after="40"/>
+            </w:pPr>
+            <w:r>
+              <w:rPr>
+                <w:sz w:val="20"/>
+              </w:rPr>
+              <w:t>can you check if groq api key works</w:t>
+            </w:r>
+          </w:p>
+        </w:tc>
+        <w:tc>
+          <w:tcPr>
+            <w:tcW w:type="dxa" w:w="4464"/>
+          </w:tcPr>
+          <w:p>
+            <w:pPr>
+              <w:spacing w:after="40"/>
+            </w:pPr>
+            <w:r>
+              <w:rPr>
+                <w:sz w:val="20"/>
+              </w:rPr>
+              <w:t>Found the default Groq model had been retired and switched it (iteration 14).</w:t>
+            </w:r>
+          </w:p>
+        </w:tc>
+      </w:tr>
+      <w:tr>
+        <w:tc>
+          <w:tcPr>
+            <w:tcW w:type="dxa" w:w="4896"/>
+          </w:tcPr>
+          <w:p>
+            <w:pPr>
+              <w:spacing w:after="40"/>
+            </w:pPr>
+            <w:r>
+              <w:rPr>
+                <w:sz w:val="20"/>
+              </w:rPr>
+              <w:t>can you commit these changes to the main branch instead of demo/planted-issues</w:t>
+            </w:r>
+          </w:p>
+        </w:tc>
+        <w:tc>
+          <w:tcPr>
+            <w:tcW w:type="dxa" w:w="4464"/>
+          </w:tcPr>
+          <w:p>
+            <w:pPr>
+              <w:spacing w:after="40"/>
+            </w:pPr>
+            <w:r>
+              <w:rPr>
+                <w:sz w:val="20"/>
+              </w:rPr>
+              <w:t>Committed the fix on main and left the demo branch with only the demo file.</w:t>
+            </w:r>
+          </w:p>
+        </w:tc>
+      </w:tr>
+      <w:tr>
+        <w:tc>
+          <w:tcPr>
+            <w:tcW w:type="dxa" w:w="4896"/>
+          </w:tcPr>
+          <w:p>
+            <w:pPr>
+              <w:spacing w:after="40"/>
+            </w:pPr>
+            <w:r>
+              <w:rPr>
+                <w:sz w:val="20"/>
+              </w:rPr>
+              <w:t>can you review the word document and see anything needs to be adjusted</w:t>
+            </w:r>
+          </w:p>
+        </w:tc>
+        <w:tc>
+          <w:tcPr>
+            <w:tcW w:type="dxa" w:w="4464"/>
+          </w:tcPr>
+          <w:p>
+            <w:pPr>
+              <w:spacing w:after="40"/>
+            </w:pPr>
+            <w:r>
+              <w:rPr>
+                <w:sz w:val="20"/>
+              </w:rPr>
+              <w:t>This revision of the document.</w:t>
+            </w:r>
+          </w:p>
+        </w:tc>
+      </w:tr>
+    </w:tbl>
+    <w:p/>
     <w:p>
       <w:pPr>
         <w:pStyle w:val="Heading2"/>
@@ -1824,6 +2149,106 @@
           </w:p>
         </w:tc>
       </w:tr>
+      <w:tr>
+        <w:tc>
+          <w:tcPr>
+            <w:tcW w:type="dxa" w:w="504"/>
+          </w:tcPr>
+          <w:p>
+            <w:pPr>
+              <w:spacing w:after="40"/>
+            </w:pPr>
+            <w:r>
+              <w:rPr>
+                <w:sz w:val="20"/>
+              </w:rPr>
+              <w:t>13</w:t>
+            </w:r>
+          </w:p>
+        </w:tc>
+        <w:tc>
+          <w:tcPr>
+            <w:tcW w:type="dxa" w:w="4320"/>
+          </w:tcPr>
+          <w:p>
+            <w:pPr>
+              <w:spacing w:after="40"/>
+            </w:pPr>
+            <w:r>
+              <w:rPr>
+                <w:sz w:val="20"/>
+              </w:rPr>
+              <w:t>Pushing the demo PR branch was rejected by GitHub: the planted fake key had the format of a real Stripe live key, and secret scanning push protection blocked it.</w:t>
+            </w:r>
+          </w:p>
+        </w:tc>
+        <w:tc>
+          <w:tcPr>
+            <w:tcW w:type="dxa" w:w="4536"/>
+          </w:tcPr>
+          <w:p>
+            <w:pPr>
+              <w:spacing w:after="40"/>
+            </w:pPr>
+            <w:r>
+              <w:rPr>
+                <w:sz w:val="20"/>
+              </w:rPr>
+              <w:t>Replaced it with a harmless value and amended the unpushed commit. The agent's own check matches the variable name (API_KEY), so it still flags it.</w:t>
+            </w:r>
+          </w:p>
+        </w:tc>
+      </w:tr>
+      <w:tr>
+        <w:tc>
+          <w:tcPr>
+            <w:tcW w:type="dxa" w:w="504"/>
+          </w:tcPr>
+          <w:p>
+            <w:pPr>
+              <w:spacing w:after="40"/>
+            </w:pPr>
+            <w:r>
+              <w:rPr>
+                <w:sz w:val="20"/>
+              </w:rPr>
+              <w:t>14</w:t>
+            </w:r>
+          </w:p>
+        </w:tc>
+        <w:tc>
+          <w:tcPr>
+            <w:tcW w:type="dxa" w:w="4320"/>
+          </w:tcPr>
+          <w:p>
+            <w:pPr>
+              <w:spacing w:after="40"/>
+            </w:pPr>
+            <w:r>
+              <w:rPr>
+                <w:sz w:val="20"/>
+              </w:rPr>
+              <w:t>The Groq key was accepted, but the default model llama-3.3-70b-versatile returned 404: Groq no longer offers it.</w:t>
+            </w:r>
+          </w:p>
+        </w:tc>
+        <w:tc>
+          <w:tcPr>
+            <w:tcW w:type="dxa" w:w="4536"/>
+          </w:tcPr>
+          <w:p>
+            <w:pPr>
+              <w:spacing w:after="40"/>
+            </w:pPr>
+            <w:r>
+              <w:rPr>
+                <w:sz w:val="20"/>
+              </w:rPr>
+              <w:t>Listed the models available to the key and switched the default to openai/gpt-oss-120b, after checking it handles plain replies, tool calls and structured output. This makes Groq a free option for demo runs.</w:t>
+            </w:r>
+          </w:p>
+        </w:tc>
+      </w:tr>
     </w:tbl>
     <w:p/>
     <w:p>
@@ -2008,6 +2433,48 @@
       </w:r>
       <w:r>
         <w:t xml:space="preserve"> The specialists over-report (15 raw findings); the orchestrator's merge step is what makes the final review short enough to read.</w:t>
+      </w:r>
+    </w:p>
+    <w:p>
+      <w:pPr>
+        <w:pStyle w:val="ListBullet"/>
+      </w:pPr>
+      <w:r>
+        <w:rPr>
+          <w:b/>
+        </w:rPr>
+        <w:t>Model catalogs change.</w:t>
+      </w:r>
+      <w:r>
+        <w:t xml:space="preserve"> A model that worked when the project was planned had been retired by the time I used it. Defaults should be easy to override (LLM_MODEL, --model), and listing the provider's models is the quickest check.</w:t>
+      </w:r>
+    </w:p>
+    <w:p>
+      <w:pPr>
+        <w:pStyle w:val="ListBullet"/>
+      </w:pPr>
+      <w:r>
+        <w:rPr>
+          <w:b/>
+        </w:rPr>
+        <w:t>Secret scanning applies to test data too.</w:t>
+      </w:r>
+      <w:r>
+        <w:t xml:space="preserve"> Even a fake key in demo code gets blocked by GitHub if it looks real. Test data for a security reviewer should be obviously fake.</w:t>
+      </w:r>
+    </w:p>
+    <w:p>
+      <w:pPr>
+        <w:pStyle w:val="ListBullet"/>
+      </w:pPr>
+      <w:r>
+        <w:rPr>
+          <w:b/>
+        </w:rPr>
+        <w:t>Plan demos around cost.</w:t>
+      </w:r>
+      <w:r>
+        <w:t xml:space="preserve"> Most of the demo runs with no LLM calls at all (offline tests, AST analysis, config errors, a saved report), and the live runs use a small PR and a free Groq model.</w:t>
       </w:r>
     </w:p>
     <w:p>
@@ -2475,7 +2942,7 @@
           <w:rFonts w:ascii="Consolas" w:hAnsi="Consolas"/>
           <w:sz w:val="19"/>
         </w:rPr>
-        <w:t>cp .env.example .env    # add GITHUB_TOKEN and an LLM key</w:t>
+        <w:t>Copy-Item .env.example .env    # add GITHUB_TOKEN and an LLM key</w:t>
       </w:r>
     </w:p>
     <w:p>
@@ -2511,7 +2978,7 @@
           <w:rFonts w:ascii="Consolas" w:hAnsi="Consolas"/>
           <w:sz w:val="19"/>
         </w:rPr>
-        <w:t>uv run code-review-agent review &lt;owner&gt;/&lt;repo&gt; &lt;pr&gt; --provider anthropic</w:t>
+        <w:t>uv run code-review-agent review &lt;owner&gt;/&lt;repo&gt; &lt;pr&gt; --provider groq    # free tier</w:t>
       </w:r>
     </w:p>
     <w:sectPr>

</xml_diff>